<commit_message>
updated DBMS practical file documentation in .docx and .pdf formats
</commit_message>
<xml_diff>
--- a/Database Management Systems Practical File.docx
+++ b/Database Management Systems Practical File.docx
@@ -352,44 +352,54 @@
         </w:rPr>
         <w:t xml:space="preserve">GitHub Link: </w:t>
       </w:r>
-      <w:hyperlink r:id="rId8" w:history="1">
-        <w:r>
-          <w:rPr>
-            <w:rStyle w:val="Hyperlink"/>
-            <w:rFonts w:ascii="Verdana" w:hAnsi="Verdana"/>
-            <w:iCs/>
-            <w:color w:val="000000" w:themeColor="text1"/>
-            <w:sz w:val="28"/>
-            <w:szCs w:val="28"/>
-            <w:u w:val="none"/>
-          </w:rPr>
-          <w:t>https://github.com/adit-ghosh/</w:t>
-        </w:r>
-        <w:r>
-          <w:rPr>
-            <w:rStyle w:val="Hyperlink"/>
-            <w:rFonts w:ascii="Verdana" w:hAnsi="Verdana"/>
-            <w:iCs/>
-            <w:color w:val="000000" w:themeColor="text1"/>
-            <w:sz w:val="28"/>
-            <w:szCs w:val="28"/>
-            <w:u w:val="none"/>
-          </w:rPr>
-          <w:t>dbms</w:t>
-        </w:r>
-        <w:r>
-          <w:rPr>
-            <w:rStyle w:val="Hyperlink"/>
-            <w:rFonts w:ascii="Verdana" w:hAnsi="Verdana"/>
-            <w:iCs/>
-            <w:color w:val="000000" w:themeColor="text1"/>
-            <w:sz w:val="28"/>
-            <w:szCs w:val="28"/>
-            <w:u w:val="none"/>
-          </w:rPr>
-          <w:t>-practical-file-2401350016</w:t>
-        </w:r>
-      </w:hyperlink>
+      <w:r>
+        <w:fldChar w:fldCharType="begin"/>
+      </w:r>
+      <w:r>
+        <w:instrText>HYPERLINK "https://github.com/adit-ghosh/dbms-practical-file-2401350016"</w:instrText>
+      </w:r>
+      <w:r>
+        <w:fldChar w:fldCharType="separate"/>
+      </w:r>
+      <w:r>
+        <w:rPr>
+          <w:rStyle w:val="Hyperlink"/>
+          <w:rFonts w:ascii="Verdana" w:hAnsi="Verdana"/>
+          <w:iCs/>
+          <w:color w:val="000000" w:themeColor="text1"/>
+          <w:sz w:val="28"/>
+          <w:szCs w:val="28"/>
+          <w:u w:val="none"/>
+        </w:rPr>
+        <w:t>https://github.com/adit-ghosh/</w:t>
+      </w:r>
+      <w:r>
+        <w:rPr>
+          <w:rStyle w:val="Hyperlink"/>
+          <w:rFonts w:ascii="Verdana" w:hAnsi="Verdana"/>
+          <w:iCs/>
+          <w:color w:val="000000" w:themeColor="text1"/>
+          <w:sz w:val="28"/>
+          <w:szCs w:val="28"/>
+          <w:u w:val="none"/>
+        </w:rPr>
+        <w:t>dbms</w:t>
+      </w:r>
+      <w:r>
+        <w:rPr>
+          <w:rStyle w:val="Hyperlink"/>
+          <w:rFonts w:ascii="Verdana" w:hAnsi="Verdana"/>
+          <w:iCs/>
+          <w:color w:val="000000" w:themeColor="text1"/>
+          <w:sz w:val="28"/>
+          <w:szCs w:val="28"/>
+          <w:u w:val="none"/>
+        </w:rPr>
+        <w:t>-practical-file-2401350016</w:t>
+      </w:r>
+      <w:r>
+        <w:fldChar w:fldCharType="end"/>
+      </w:r>
     </w:p>
     <w:p>
       <w:pPr>
@@ -2033,7 +2043,7 @@
                     <pic:cNvPicPr/>
                   </pic:nvPicPr>
                   <pic:blipFill>
-                    <a:blip r:embed="rId9"/>
+                    <a:blip r:embed="rId8"/>
                     <a:stretch>
                       <a:fillRect/>
                     </a:stretch>
@@ -2078,7 +2088,7 @@
                     <pic:cNvPicPr/>
                   </pic:nvPicPr>
                   <pic:blipFill>
-                    <a:blip r:embed="rId10"/>
+                    <a:blip r:embed="rId9"/>
                     <a:stretch>
                       <a:fillRect/>
                     </a:stretch>
@@ -2211,7 +2221,7 @@
                     <pic:cNvPicPr/>
                   </pic:nvPicPr>
                   <pic:blipFill>
-                    <a:blip r:embed="rId11"/>
+                    <a:blip r:embed="rId10"/>
                     <a:stretch>
                       <a:fillRect/>
                     </a:stretch>
@@ -2256,7 +2266,7 @@
                     <pic:cNvPicPr/>
                   </pic:nvPicPr>
                   <pic:blipFill>
-                    <a:blip r:embed="rId12"/>
+                    <a:blip r:embed="rId11"/>
                     <a:stretch>
                       <a:fillRect/>
                     </a:stretch>
@@ -2301,7 +2311,7 @@
                     <pic:cNvPicPr/>
                   </pic:nvPicPr>
                   <pic:blipFill>
-                    <a:blip r:embed="rId13"/>
+                    <a:blip r:embed="rId12"/>
                     <a:stretch>
                       <a:fillRect/>
                     </a:stretch>
@@ -2346,7 +2356,7 @@
                     <pic:cNvPicPr/>
                   </pic:nvPicPr>
                   <pic:blipFill>
-                    <a:blip r:embed="rId14"/>
+                    <a:blip r:embed="rId13"/>
                     <a:stretch>
                       <a:fillRect/>
                     </a:stretch>
@@ -2526,7 +2536,7 @@
                     <pic:cNvPicPr/>
                   </pic:nvPicPr>
                   <pic:blipFill>
-                    <a:blip r:embed="rId15"/>
+                    <a:blip r:embed="rId14"/>
                     <a:stretch>
                       <a:fillRect/>
                     </a:stretch>
@@ -2572,7 +2582,7 @@
                     <pic:cNvPicPr/>
                   </pic:nvPicPr>
                   <pic:blipFill>
-                    <a:blip r:embed="rId16"/>
+                    <a:blip r:embed="rId15"/>
                     <a:stretch>
                       <a:fillRect/>
                     </a:stretch>
@@ -2694,7 +2704,7 @@
                     <pic:cNvPicPr/>
                   </pic:nvPicPr>
                   <pic:blipFill>
-                    <a:blip r:embed="rId17"/>
+                    <a:blip r:embed="rId16"/>
                     <a:stretch>
                       <a:fillRect/>
                     </a:stretch>
@@ -2739,7 +2749,7 @@
                     <pic:cNvPicPr/>
                   </pic:nvPicPr>
                   <pic:blipFill>
-                    <a:blip r:embed="rId18"/>
+                    <a:blip r:embed="rId17"/>
                     <a:stretch>
                       <a:fillRect/>
                     </a:stretch>
@@ -2784,7 +2794,7 @@
                     <pic:cNvPicPr/>
                   </pic:nvPicPr>
                   <pic:blipFill>
-                    <a:blip r:embed="rId19"/>
+                    <a:blip r:embed="rId18"/>
                     <a:stretch>
                       <a:fillRect/>
                     </a:stretch>
@@ -2829,7 +2839,7 @@
                     <pic:cNvPicPr/>
                   </pic:nvPicPr>
                   <pic:blipFill>
-                    <a:blip r:embed="rId20"/>
+                    <a:blip r:embed="rId19"/>
                     <a:stretch>
                       <a:fillRect/>
                     </a:stretch>
@@ -3003,7 +3013,7 @@
                     <pic:cNvPicPr/>
                   </pic:nvPicPr>
                   <pic:blipFill>
-                    <a:blip r:embed="rId21"/>
+                    <a:blip r:embed="rId20"/>
                     <a:stretch>
                       <a:fillRect/>
                     </a:stretch>
@@ -3200,7 +3210,7 @@
                     <pic:cNvPicPr/>
                   </pic:nvPicPr>
                   <pic:blipFill>
-                    <a:blip r:embed="rId22"/>
+                    <a:blip r:embed="rId21"/>
                     <a:stretch>
                       <a:fillRect/>
                     </a:stretch>
@@ -3857,7 +3867,7 @@
                     <pic:cNvPicPr/>
                   </pic:nvPicPr>
                   <pic:blipFill>
-                    <a:blip r:embed="rId23"/>
+                    <a:blip r:embed="rId22"/>
                     <a:stretch>
                       <a:fillRect/>
                     </a:stretch>
@@ -4039,7 +4049,7 @@
                     <pic:cNvPicPr/>
                   </pic:nvPicPr>
                   <pic:blipFill>
-                    <a:blip r:embed="rId24"/>
+                    <a:blip r:embed="rId23"/>
                     <a:stretch>
                       <a:fillRect/>
                     </a:stretch>
@@ -4095,7 +4105,7 @@
                     <pic:cNvPicPr/>
                   </pic:nvPicPr>
                   <pic:blipFill>
-                    <a:blip r:embed="rId25"/>
+                    <a:blip r:embed="rId24"/>
                     <a:stretch>
                       <a:fillRect/>
                     </a:stretch>
@@ -4151,7 +4161,7 @@
                     <pic:cNvPicPr/>
                   </pic:nvPicPr>
                   <pic:blipFill>
-                    <a:blip r:embed="rId26"/>
+                    <a:blip r:embed="rId25"/>
                     <a:stretch>
                       <a:fillRect/>
                     </a:stretch>
@@ -4207,7 +4217,7 @@
                     <pic:cNvPicPr/>
                   </pic:nvPicPr>
                   <pic:blipFill>
-                    <a:blip r:embed="rId27"/>
+                    <a:blip r:embed="rId26"/>
                     <a:stretch>
                       <a:fillRect/>
                     </a:stretch>
@@ -4263,7 +4273,7 @@
                     <pic:cNvPicPr/>
                   </pic:nvPicPr>
                   <pic:blipFill>
-                    <a:blip r:embed="rId28"/>
+                    <a:blip r:embed="rId27"/>
                     <a:stretch>
                       <a:fillRect/>
                     </a:stretch>
@@ -4521,7 +4531,7 @@
                     <pic:cNvPicPr/>
                   </pic:nvPicPr>
                   <pic:blipFill>
-                    <a:blip r:embed="rId29"/>
+                    <a:blip r:embed="rId28"/>
                     <a:stretch>
                       <a:fillRect/>
                     </a:stretch>
@@ -4567,7 +4577,7 @@
                     <pic:cNvPicPr/>
                   </pic:nvPicPr>
                   <pic:blipFill>
-                    <a:blip r:embed="rId30"/>
+                    <a:blip r:embed="rId29"/>
                     <a:stretch>
                       <a:fillRect/>
                     </a:stretch>
@@ -4742,7 +4752,7 @@
                     <pic:cNvPicPr/>
                   </pic:nvPicPr>
                   <pic:blipFill>
-                    <a:blip r:embed="rId31"/>
+                    <a:blip r:embed="rId30"/>
                     <a:stretch>
                       <a:fillRect/>
                     </a:stretch>
@@ -4798,7 +4808,7 @@
                     <pic:cNvPicPr/>
                   </pic:nvPicPr>
                   <pic:blipFill>
-                    <a:blip r:embed="rId32"/>
+                    <a:blip r:embed="rId31"/>
                     <a:stretch>
                       <a:fillRect/>
                     </a:stretch>
@@ -4854,7 +4864,7 @@
                     <pic:cNvPicPr/>
                   </pic:nvPicPr>
                   <pic:blipFill>
-                    <a:blip r:embed="rId33"/>
+                    <a:blip r:embed="rId32"/>
                     <a:stretch>
                       <a:fillRect/>
                     </a:stretch>
@@ -5123,7 +5133,7 @@
                     <pic:cNvPicPr/>
                   </pic:nvPicPr>
                   <pic:blipFill>
-                    <a:blip r:embed="rId34"/>
+                    <a:blip r:embed="rId33"/>
                     <a:stretch>
                       <a:fillRect/>
                     </a:stretch>
@@ -5169,7 +5179,7 @@
                     <pic:cNvPicPr/>
                   </pic:nvPicPr>
                   <pic:blipFill>
-                    <a:blip r:embed="rId35"/>
+                    <a:blip r:embed="rId34"/>
                     <a:stretch>
                       <a:fillRect/>
                     </a:stretch>
@@ -5320,7 +5330,7 @@
                     <pic:cNvPicPr/>
                   </pic:nvPicPr>
                   <pic:blipFill>
-                    <a:blip r:embed="rId36"/>
+                    <a:blip r:embed="rId35"/>
                     <a:stretch>
                       <a:fillRect/>
                     </a:stretch>
@@ -5371,7 +5381,7 @@
                     <pic:cNvPicPr/>
                   </pic:nvPicPr>
                   <pic:blipFill>
-                    <a:blip r:embed="rId37"/>
+                    <a:blip r:embed="rId36"/>
                     <a:stretch>
                       <a:fillRect/>
                     </a:stretch>
@@ -5672,7 +5682,7 @@
                     <pic:cNvPicPr/>
                   </pic:nvPicPr>
                   <pic:blipFill>
-                    <a:blip r:embed="rId38"/>
+                    <a:blip r:embed="rId37"/>
                     <a:stretch>
                       <a:fillRect/>
                     </a:stretch>
@@ -5718,7 +5728,7 @@
                     <pic:cNvPicPr/>
                   </pic:nvPicPr>
                   <pic:blipFill>
-                    <a:blip r:embed="rId39"/>
+                    <a:blip r:embed="rId38"/>
                     <a:stretch>
                       <a:fillRect/>
                     </a:stretch>
@@ -5907,7 +5917,7 @@
                     <pic:cNvPicPr/>
                   </pic:nvPicPr>
                   <pic:blipFill>
-                    <a:blip r:embed="rId40"/>
+                    <a:blip r:embed="rId39"/>
                     <a:stretch>
                       <a:fillRect/>
                     </a:stretch>
@@ -5958,7 +5968,7 @@
                     <pic:cNvPicPr/>
                   </pic:nvPicPr>
                   <pic:blipFill>
-                    <a:blip r:embed="rId41"/>
+                    <a:blip r:embed="rId40"/>
                     <a:stretch>
                       <a:fillRect/>
                     </a:stretch>
@@ -6268,7 +6278,7 @@
                     <pic:cNvPicPr/>
                   </pic:nvPicPr>
                   <pic:blipFill>
-                    <a:blip r:embed="rId42"/>
+                    <a:blip r:embed="rId41"/>
                     <a:stretch>
                       <a:fillRect/>
                     </a:stretch>
@@ -6478,7 +6488,7 @@
                     <pic:cNvPicPr/>
                   </pic:nvPicPr>
                   <pic:blipFill>
-                    <a:blip r:embed="rId43"/>
+                    <a:blip r:embed="rId42"/>
                     <a:stretch>
                       <a:fillRect/>
                     </a:stretch>
@@ -6698,7 +6708,7 @@
       </w:pPr>
     </w:p>
     <w:sectPr>
-      <w:footerReference w:type="default" r:id="rId44"/>
+      <w:footerReference w:type="default" r:id="rId43"/>
       <w:pgSz w:w="11906" w:h="16838"/>
       <w:pgMar w:top="1440" w:right="1440" w:bottom="1440" w:left="1440" w:header="708" w:footer="708" w:gutter="0"/>
       <w:pgBorders w:offsetFrom="page">
@@ -7422,6 +7432,7 @@
   <w:style w:type="character" w:default="1" w:styleId="DefaultParagraphFont">
     <w:name w:val="Default Paragraph Font"/>
     <w:uiPriority w:val="1"/>
+    <w:semiHidden/>
     <w:unhideWhenUsed/>
   </w:style>
   <w:style w:type="table" w:default="1" w:styleId="TableNormal">

</xml_diff>